<commit_message>
docs(source): expand DevBrain v2 specification
</commit_message>
<xml_diff>
--- a/source/DevBrain_v2_Developer_Context_Specification.docx
+++ b/source/DevBrain_v2_Developer_Context_Specification.docx
@@ -4,7 +4,7 @@
   <w:body>
     <w:p>
       <w:pPr>
-        <w:pStyle w:val="Heading1"/>
+        <w:pStyle w:val="Title"/>
         <w:bidi w:val="0"/>
         <w:spacing w:before="240" w:after="200"/>
         <w:jc w:val="start"/>
@@ -89,6 +89,30 @@
     </w:p>
     <w:p>
       <w:pPr>
+        <w:pStyle w:val="BodyText"/>
+        <w:bidi w:val="0"/>
+        <w:jc w:val="start"/>
+        <w:rPr/>
+      </w:pPr>
+      <w:r>
+        <w:rPr/>
+        <w:t>The intended reader is a developer, maintainer, or reviewer who needs to understand how DevBrain influences an assistant without treating the document as a prompt to paste into every session. A reader should be able to identify which rules travel across repositories, what belongs in a project, when the assistant can work independently, and which actions require a specific decision.</w:t>
+      </w:r>
+    </w:p>
+    <w:p>
+      <w:pPr>
+        <w:pStyle w:val="BodyText"/>
+        <w:bidi w:val="0"/>
+        <w:jc w:val="start"/>
+        <w:rPr/>
+      </w:pPr>
+      <w:r>
+        <w:rPr/>
+        <w:t>DevBrain does not claim to make a model inherently more capable. Its practical effect is to give the model relevant context and decision rules at the moment they are useful. The host still decides what tools exist, what permissions apply, how much context is available, and how reliably instructions are followed. These limits matter when assessing results.</w:t>
+      </w:r>
+    </w:p>
+    <w:p>
+      <w:pPr>
         <w:pStyle w:val="Heading2"/>
         <w:bidi w:val="0"/>
         <w:jc w:val="start"/>
@@ -283,6 +307,66 @@
       <w:r>
         <w:rPr/>
         <w:t>The baseline deliberately repeats a small number of critical safety and precedence rules so they remain available. Other material is linked through the task map. Skill references, source documents, changelogs, and maintenance reports are excluded from normal startup context.</w:t>
+      </w:r>
+    </w:p>
+    <w:p>
+      <w:pPr>
+        <w:pStyle w:val="Heading3"/>
+        <w:bidi w:val="0"/>
+        <w:jc w:val="start"/>
+        <w:rPr/>
+      </w:pPr>
+      <w:r>
+        <w:rPr/>
+        <w:t>How the parts connect</w:t>
+      </w:r>
+    </w:p>
+    <w:p>
+      <w:pPr>
+        <w:pStyle w:val="BodyText"/>
+        <w:bidi w:val="0"/>
+        <w:jc w:val="start"/>
+        <w:rPr/>
+      </w:pPr>
+      <w:r>
+        <w:rPr/>
+        <w:t>The bootstrap answers one question: where can the assistant find DevBrain? The baseline answers what it must know for almost any coding task. The task map points to deeper guidance when a particular kind of decision appears. Core explains the principles behind a choice, safety defines protected boundaries, and workflows turn those principles into a sequence of work. A skill adds focused instructions for a specialized outcome. Project instructions and the actual code supply the facts those modules cannot know globally.</w:t>
+      </w:r>
+    </w:p>
+    <w:p>
+      <w:pPr>
+        <w:pStyle w:val="BodyText"/>
+        <w:bidi w:val="0"/>
+        <w:jc w:val="start"/>
+        <w:rPr/>
+      </w:pPr>
+      <w:r>
+        <w:rPr/>
+        <w:t>For example, a request to improve a data table begins with the baseline and the active project's instructions. The assistant may then read UI principles and an enterprise UI skill. If the table depends on an API response, it inspects that contract in the project. It does not read the marketing skill, migration workflow, historical source, and every design reference merely because they exist.</w:t>
+      </w:r>
+    </w:p>
+    <w:p>
+      <w:pPr>
+        <w:pStyle w:val="Heading3"/>
+        <w:bidi w:val="0"/>
+        <w:jc w:val="start"/>
+        <w:rPr/>
+      </w:pPr>
+      <w:r>
+        <w:rPr/>
+        <w:t>Why the source document is separate</w:t>
+      </w:r>
+    </w:p>
+    <w:p>
+      <w:pPr>
+        <w:pStyle w:val="BodyText"/>
+        <w:bidi w:val="0"/>
+        <w:jc w:val="start"/>
+        <w:rPr/>
+      </w:pPr>
+      <w:r>
+        <w:rPr/>
+        <w:t>This DOCX explains the system for people reviewing or evolving it. The operational rules are maintained in Markdown and YAML so the assistant can load the narrowest useful part. A change to this conceptual document does not automatically change active behavior. When a new principle is accepted, a maintainer updates its canonical module, checks the routes and examples that depend on it, and records the intended behavior in evaluation.</w:t>
       </w:r>
     </w:p>
     <w:p>
@@ -518,6 +602,54 @@
     </w:p>
     <w:p>
       <w:pPr>
+        <w:pStyle w:val="Heading3"/>
+        <w:bidi w:val="0"/>
+        <w:jc w:val="start"/>
+        <w:rPr/>
+      </w:pPr>
+      <w:r>
+        <w:rPr/>
+        <w:t>Illustrative coding session</w:t>
+      </w:r>
+    </w:p>
+    <w:p>
+      <w:pPr>
+        <w:pStyle w:val="BodyText"/>
+        <w:bidi w:val="0"/>
+        <w:jc w:val="start"/>
+        <w:rPr/>
+      </w:pPr>
+      <w:r>
+        <w:rPr/>
+        <w:t>Suppose a developer opens a repository and says, “Hi Claude.” The installed Claude loader points to the DevBrain baseline and tells the assistant to read it once before substantial coding work. The assistant also reads the project's applicable instructions. A greeting alone does not require a scan of every module. When the next request asks for a dashboard redesign, the assistant reuses the baseline, inspects the project's visual conventions and the affected screen, and selects the UI guidance and relevant skill. Later messages in that same session reuse those active rules unless a reload condition occurs.</w:t>
+      </w:r>
+    </w:p>
+    <w:p>
+      <w:pPr>
+        <w:pStyle w:val="BodyText"/>
+        <w:bidi w:val="0"/>
+        <w:jc w:val="start"/>
+        <w:rPr/>
+      </w:pPr>
+      <w:r>
+        <w:rPr/>
+        <w:t>The same conceptual sequence applies to Codex through its own loader. The loaders can have different host filenames and installation locations, but their managed instruction content has the same meaning. Neither loader runs DevBrain as a background process. The host model reads text and uses it while deciding how to answer or which tools to call.</w:t>
+      </w:r>
+    </w:p>
+    <w:p>
+      <w:pPr>
+        <w:pStyle w:val="BodyText"/>
+        <w:bidi w:val="0"/>
+        <w:jc w:val="start"/>
+        <w:rPr/>
+      </w:pPr>
+      <w:r>
+        <w:rPr/>
+        <w:t>If the developer then says, “Keep this screen minimal; the previous card layout was too busy,” that newer instruction governs the active design decision. The assistant should adapt the screen without reopening the source DOCX or asking whether the older default still applies. If the request also implied a permission change, the assistant would identify that separate protected action before making it.</w:t>
+      </w:r>
+    </w:p>
+    <w:p>
+      <w:pPr>
         <w:pStyle w:val="Heading2"/>
         <w:bidi w:val="0"/>
         <w:jc w:val="start"/>
@@ -554,6 +686,46 @@
     </w:p>
     <w:p>
       <w:pPr>
+        <w:pStyle w:val="Heading3"/>
+        <w:bidi w:val="0"/>
+        <w:jc w:val="start"/>
+        <w:rPr/>
+      </w:pPr>
+      <w:r>
+        <w:rPr/>
+        <w:t>A practical classification rule</w:t>
+      </w:r>
+    </w:p>
+    <w:p>
+      <w:pPr>
+        <w:pStyle w:val="BodyText"/>
+        <w:bidi w:val="0"/>
+        <w:jc w:val="start"/>
+        <w:rPr/>
+      </w:pPr>
+      <w:r>
+        <w:rPr/>
+        <w:t>“</w:t>
+      </w:r>
+      <w:r>
+        <w:rPr/>
+        <w:t>Prefer clear responsibility boundaries” is a global engineering principle. “This repository uses a particular router, UI library, color palette, and command for type checking” is project context. “This actor may approve a payment” is a business and permission rule that belongs in the project and must be verified against the implementation. DevBrain can tell an assistant to look for those facts; it cannot supply them for an unknown repository.</w:t>
+      </w:r>
+    </w:p>
+    <w:p>
+      <w:pPr>
+        <w:pStyle w:val="BodyText"/>
+        <w:bidi w:val="0"/>
+        <w:jc w:val="start"/>
+        <w:rPr/>
+      </w:pPr>
+      <w:r>
+        <w:rPr/>
+        <w:t>The distinction protects portability. A developer can move DevBrain to another device or use it with another repository without importing unrelated endpoints, client names, design choices, or operational commands. If project guidance is missing, the assistant should infer low-risk details from the code and established patterns, state consequential assumptions, and ask only when unresolved facts could materially change the outcome.</w:t>
+      </w:r>
+    </w:p>
+    <w:p>
+      <w:pPr>
         <w:pStyle w:val="Heading2"/>
         <w:bidi w:val="0"/>
         <w:jc w:val="start"/>
@@ -654,6 +826,54 @@
     </w:p>
     <w:p>
       <w:pPr>
+        <w:pStyle w:val="Heading3"/>
+        <w:bidi w:val="0"/>
+        <w:jc w:val="start"/>
+        <w:rPr/>
+      </w:pPr>
+      <w:r>
+        <w:rPr/>
+        <w:t>Examples of proportional decisions</w:t>
+      </w:r>
+    </w:p>
+    <w:p>
+      <w:pPr>
+        <w:pStyle w:val="BodyText"/>
+        <w:bidi w:val="0"/>
+        <w:jc w:val="start"/>
+        <w:rPr/>
+      </w:pPr>
+      <w:r>
+        <w:rPr/>
+        <w:t>A request to improve form spacing, labels, keyboard focus, and small-screen behavior is normally low risk. The assistant can inspect the current component, implement the improvement, and report what it checked. A redesign of a shared navigation shell can affect many screens, so the assistant first maps consumers, responsive states, and visual conventions; when the requested redesign stays within those boundaries, it proceeds as medium-risk work.</w:t>
+      </w:r>
+    </w:p>
+    <w:p>
+      <w:pPr>
+        <w:pStyle w:val="BodyText"/>
+        <w:bidi w:val="0"/>
+        <w:jc w:val="start"/>
+        <w:rPr/>
+      </w:pPr>
+      <w:r>
+        <w:rPr/>
+        <w:t>A request to change a role check is different even if it takes one line. It alters a security boundary and needs specific confirmation of the target and effect before implementation. Similarly, reading an API contract to plan a change is safe investigation; silently replacing a response field that external consumers use is a breaking change. An additive migration file can be prepared when requested and analyzed, while executing a destructive migration or rewriting real data requires separate authorization.</w:t>
+      </w:r>
+    </w:p>
+    <w:p>
+      <w:pPr>
+        <w:pStyle w:val="BodyText"/>
+        <w:bidi w:val="0"/>
+        <w:jc w:val="start"/>
+        <w:rPr/>
+      </w:pPr>
+      <w:r>
+        <w:rPr/>
+        <w:t>Approval attaches to an action and scope, not to a vague sense that the assistant is generally trusted. If the user authorizes one deployment target, that does not authorize a second target. If the user asks for a command list, the result is a list for review, even when the printed lines contain mutating commands. The assistant can still complete independent safe work while waiting at a protected boundary.</w:t>
+      </w:r>
+    </w:p>
+    <w:p>
+      <w:pPr>
         <w:pStyle w:val="Heading2"/>
         <w:bidi w:val="0"/>
         <w:jc w:val="start"/>
@@ -690,6 +910,42 @@
     </w:p>
     <w:p>
       <w:pPr>
+        <w:pStyle w:val="Heading3"/>
+        <w:bidi w:val="0"/>
+        <w:jc w:val="start"/>
+        <w:rPr/>
+      </w:pPr>
+      <w:r>
+        <w:rPr/>
+        <w:t>How a vague request becomes a bounded task</w:t>
+      </w:r>
+    </w:p>
+    <w:p>
+      <w:pPr>
+        <w:pStyle w:val="BodyText"/>
+        <w:bidi w:val="0"/>
+        <w:jc w:val="start"/>
+        <w:rPr/>
+      </w:pPr>
+      <w:r>
+        <w:rPr/>
+        <w:t>When a developer says “make this page feel more polished,” the assistant forms concrete hypotheses from the page goal and current implementation. It may improve hierarchy, text rhythm, empty and loading states, spacing, and responsive behavior. It should inspect the actual theme and neighboring screens before choosing colors or components. It need not ask about every button radius or margin. A proposal to add a new export feature or change who can see the page requires a different basis because it changes product behavior.</w:t>
+      </w:r>
+    </w:p>
+    <w:p>
+      <w:pPr>
+        <w:pStyle w:val="BodyText"/>
+        <w:bidi w:val="0"/>
+        <w:jc w:val="start"/>
+        <w:rPr/>
+      </w:pPr>
+      <w:r>
+        <w:rPr/>
+        <w:t>Completion means the stated outcome works across relevant states and can be reviewed, not that the assistant changed as many files as possible. The assistant stops adding work when further additions bring little benefit or require speculative product decisions. Where an assumption matters, it records the assumption with the final result so the developer can correct it.</w:t>
+      </w:r>
+    </w:p>
+    <w:p>
+      <w:pPr>
         <w:pStyle w:val="Heading2"/>
         <w:bidi w:val="0"/>
         <w:jc w:val="start"/>
@@ -726,6 +982,78 @@
     </w:p>
     <w:p>
       <w:pPr>
+        <w:pStyle w:val="Heading3"/>
+        <w:bidi w:val="0"/>
+        <w:jc w:val="start"/>
+        <w:rPr/>
+      </w:pPr>
+      <w:r>
+        <w:rPr/>
+        <w:t>From screen evidence to implementation</w:t>
+      </w:r>
+    </w:p>
+    <w:p>
+      <w:pPr>
+        <w:pStyle w:val="BodyText"/>
+        <w:bidi w:val="0"/>
+        <w:jc w:val="start"/>
+        <w:rPr/>
+      </w:pPr>
+      <w:r>
+        <w:rPr/>
+        <w:t>For a dashboard request, the assistant identifies the users' primary question and action before moving elements. It checks whether the existing page is dense because its users need quick comparison, or merely cluttered because information lacks hierarchy. It follows the project's most mature screen, tokens, icon style, and component library. It then handles relevant empty, loading, error, disabled, success, and permission-limited states rather than presenting a polished full-data screenshot as the whole solution.</w:t>
+      </w:r>
+    </w:p>
+    <w:p>
+      <w:pPr>
+        <w:pStyle w:val="BodyText"/>
+        <w:bidi w:val="0"/>
+        <w:jc w:val="start"/>
+        <w:rPr/>
+      </w:pPr>
+      <w:r>
+        <w:rPr/>
+        <w:t>On a small viewport, a table may need a scroll affordance, a different information priority, or a compact record view. The correct choice depends on the task and the data, not a global mobile pattern. Keyboard focus, semantic labels, readable contrast, touch targets, and feedback for actions remain part of the design. Visual changes should be checked in the running UI when a runtime is available.</w:t>
+      </w:r>
+    </w:p>
+    <w:p>
+      <w:pPr>
+        <w:pStyle w:val="BodyText"/>
+        <w:bidi w:val="0"/>
+        <w:jc w:val="start"/>
+        <w:rPr/>
+      </w:pPr>
+      <w:r>
+        <w:rPr/>
+        <w:t>A landing page uses a different reasoning path: narrative order, evidence, credibility, conversion intent, and responsive reading flow matter more than operational density. The marketing skill may help there, while the enterprise skill fits dashboards and internal tools. Both remain anchored to the active project's visual language.</w:t>
+      </w:r>
+    </w:p>
+    <w:p>
+      <w:pPr>
+        <w:pStyle w:val="Heading3"/>
+        <w:bidi w:val="0"/>
+        <w:jc w:val="start"/>
+        <w:rPr/>
+      </w:pPr>
+      <w:r>
+        <w:rPr/>
+        <w:t>When a shared component is justified</w:t>
+      </w:r>
+    </w:p>
+    <w:p>
+      <w:pPr>
+        <w:pStyle w:val="BodyText"/>
+        <w:bidi w:val="0"/>
+        <w:jc w:val="start"/>
+        <w:rPr/>
+      </w:pPr>
+      <w:r>
+        <w:rPr/>
+        <w:t>A reusable component earns its place when multiple consumers share a stable visual or behavioral contract. Two similar blocks are not enough if their data, states, and future changes differ. A feature-local component can keep a page readable without committing the whole product to an abstraction. When a shared component is introduced, the assistant checks affected consumers and avoids silently changing their behavior.</w:t>
+      </w:r>
+    </w:p>
+    <w:p>
+      <w:pPr>
         <w:pStyle w:val="Heading2"/>
         <w:bidi w:val="0"/>
         <w:jc w:val="start"/>
@@ -762,6 +1090,54 @@
     </w:p>
     <w:p>
       <w:pPr>
+        <w:pStyle w:val="Heading3"/>
+        <w:bidi w:val="0"/>
+        <w:jc w:val="start"/>
+        <w:rPr/>
+      </w:pPr>
+      <w:r>
+        <w:rPr/>
+        <w:t>Contract first implementation</w:t>
+      </w:r>
+    </w:p>
+    <w:p>
+      <w:pPr>
+        <w:pStyle w:val="BodyText"/>
+        <w:bidi w:val="0"/>
+        <w:jc w:val="start"/>
+        <w:rPr/>
+      </w:pPr>
+      <w:r>
+        <w:rPr/>
+        <w:t>Before adding or modifying an API feature, the assistant identifies the actor and goal, route and method, request shape, response shape, validation, error behavior, and all known consumers. It checks where authentication, ownership, and tenant scope are enforced. A handler should translate transport concerns and call a service or use case when domain logic warrants one; data access should have a clear boundary. These are quality guides rather than folder names to impose on an unfamiliar codebase.</w:t>
+      </w:r>
+    </w:p>
+    <w:p>
+      <w:pPr>
+        <w:pStyle w:val="BodyText"/>
+        <w:bidi w:val="0"/>
+        <w:jc w:val="start"/>
+        <w:rPr/>
+      </w:pPr>
+      <w:r>
+        <w:rPr/>
+        <w:t>For example, a compatible change to a list endpoint may preserve existing response fields while adding an optional filter that uses established validation and pagination rules. The assistant checks the frontend consumer and negative cases, including malformed input and forbidden access. It does not add a new endpoint, database table, or background job simply because the architecture could accommodate one.</w:t>
+      </w:r>
+    </w:p>
+    <w:p>
+      <w:pPr>
+        <w:pStyle w:val="BodyText"/>
+        <w:bidi w:val="0"/>
+        <w:jc w:val="start"/>
+        <w:rPr/>
+      </w:pPr>
+      <w:r>
+        <w:rPr/>
+        <w:t>When requests can repeat, idempotency and transaction behavior matter. A retry after a timeout must not silently duplicate a record if the contract promises one operation. If a write spans several records, partial failure and rollback need explicit treatment. Tests or local fixtures should use synthetic data; production and client data are not examples for documentation or evaluation.</w:t>
+      </w:r>
+    </w:p>
+    <w:p>
+      <w:pPr>
         <w:pStyle w:val="Heading2"/>
         <w:bidi w:val="0"/>
         <w:jc w:val="start"/>
@@ -850,6 +1226,66 @@
     </w:p>
     <w:p>
       <w:pPr>
+        <w:pStyle w:val="Heading3"/>
+        <w:bidi w:val="0"/>
+        <w:jc w:val="start"/>
+        <w:rPr/>
+      </w:pPr>
+      <w:r>
+        <w:rPr/>
+        <w:t>Progressive disclosure in practice</w:t>
+      </w:r>
+    </w:p>
+    <w:p>
+      <w:pPr>
+        <w:pStyle w:val="BodyText"/>
+        <w:bidi w:val="0"/>
+        <w:jc w:val="start"/>
+        <w:rPr/>
+      </w:pPr>
+      <w:r>
+        <w:rPr/>
+        <w:t>For an enterprise table improvement, the assistant can load the enterprise UI skill and read a specific pattern reference if a table or filter decision needs more detail. It does not need the marketing references. For a design token migration across multiple screens, the design system skill becomes primary; architecture refactor guidance is added only if responsibility or dependency boundaries are also changing. A large backend handler calls for architecture refactor guidance, not an automatic UI skill.</w:t>
+      </w:r>
+    </w:p>
+    <w:p>
+      <w:pPr>
+        <w:pStyle w:val="BodyText"/>
+        <w:bidi w:val="0"/>
+        <w:jc w:val="start"/>
+        <w:rPr/>
+      </w:pPr>
+      <w:r>
+        <w:rPr/>
+        <w:t>Skills describe how to perform focused work and may repeat a small safety boundary because each skill can be installed independently. Their descriptions help selection before their full content is read. Keeping references separate prevents every coding session from paying for examples that may never affect its task.</w:t>
+      </w:r>
+    </w:p>
+    <w:p>
+      <w:pPr>
+        <w:pStyle w:val="Heading3"/>
+        <w:bidi w:val="0"/>
+        <w:jc w:val="start"/>
+        <w:rPr/>
+      </w:pPr>
+      <w:r>
+        <w:rPr/>
+        <w:t>Workflows and compressed commands</w:t>
+      </w:r>
+    </w:p>
+    <w:p>
+      <w:pPr>
+        <w:pStyle w:val="BodyText"/>
+        <w:bidi w:val="0"/>
+        <w:jc w:val="start"/>
+        <w:rPr/>
+      </w:pPr>
+      <w:r>
+        <w:rPr/>
+        <w:t>A workflow describes a sequence such as discover the existing API contract, map consumers, implement a compatible change, verify failure cases, and report the result. A compressed command is a short way for the developer to express that intent. It should route the assistant toward the correct workflow without becoming a hidden expansion of scope or permission.</w:t>
+      </w:r>
+    </w:p>
+    <w:p>
+      <w:pPr>
         <w:pStyle w:val="Heading2"/>
         <w:bidi w:val="0"/>
         <w:jc w:val="start"/>
@@ -906,6 +1342,52 @@
     </w:p>
     <w:p>
       <w:pPr>
+        <w:pStyle w:val="Heading3"/>
+        <w:bidi w:val="0"/>
+        <w:jc w:val="start"/>
+        <w:rPr/>
+      </w:pPr>
+      <w:r>
+        <w:rPr/>
+        <w:t>Portable installation sequence</w:t>
+      </w:r>
+    </w:p>
+    <w:p>
+      <w:pPr>
+        <w:pStyle w:val="BodyText"/>
+        <w:bidi w:val="0"/>
+        <w:jc w:val="start"/>
+        <w:rPr/>
+      </w:pPr>
+      <w:r>
+        <w:rPr/>
+        <w:t>On a new device, the developer clones the repository into any suitable folder and invokes the installer as a regular user. The installer locates its own repository root and the selected user profile, previews the planned changes when requested, and installs the Codex and Claude bootstrap plus the four custom skills. It injects a concrete local repository path only into the installed loader, because the host must know where to read the baseline. That device path does not flow back into version-controlled DevBrain files.</w:t>
+      </w:r>
+    </w:p>
+    <w:p>
+      <w:pPr>
+        <w:pStyle w:val="BodyText"/>
+        <w:bidi w:val="0"/>
+        <w:jc w:val="start"/>
+        <w:rPr/>
+      </w:pPr>
+      <w:r>
+        <w:rPr/>
+        <w:t xml:space="preserve">On update, the installer uses managed markers and backups so personal text outside its block remains intact. </w:t>
+      </w:r>
+      <w:r>
+        <w:rPr>
+          <w:rStyle w:val="SourceText"/>
+        </w:rPr>
+        <w:t>-SkipSkills</w:t>
+      </w:r>
+      <w:r>
+        <w:rPr/>
+        <w:t xml:space="preserve"> allows a bootstrap-only operation. The two host adapters may differ in filenames and host conventions, but their maintained Markdown instructions have the same content. Portability checks should use a relocated clone and simulated home paths rather than assuming the original username or drive.</w:t>
+      </w:r>
+    </w:p>
+    <w:p>
+      <w:pPr>
         <w:pStyle w:val="Heading2"/>
         <w:bidi w:val="0"/>
         <w:jc w:val="start"/>
@@ -942,6 +1424,66 @@
     </w:p>
     <w:p>
       <w:pPr>
+        <w:pStyle w:val="Heading3"/>
+        <w:bidi w:val="0"/>
+        <w:jc w:val="start"/>
+        <w:rPr/>
+      </w:pPr>
+      <w:r>
+        <w:rPr/>
+        <w:t>What the evaluation suite measures</w:t>
+      </w:r>
+    </w:p>
+    <w:p>
+      <w:pPr>
+        <w:pStyle w:val="BodyText"/>
+        <w:bidi w:val="0"/>
+        <w:jc w:val="start"/>
+        <w:rPr/>
+      </w:pPr>
+      <w:r>
+        <w:rPr/>
+        <w:t>Each scenario gives a representative prompt and records which context should be read, which skill should be selected, how independently the assistant should act, whether approval is required, which files may change, what validation is expected, and what behavior is forbidden. Cases include low-risk UI polish, larger redesigns, shared refactoring, API changes, authentication, data operations, Git command listings, conflicting instructions, and requests that discourage questions.</w:t>
+      </w:r>
+    </w:p>
+    <w:p>
+      <w:pPr>
+        <w:pStyle w:val="BodyText"/>
+        <w:bidi w:val="0"/>
+        <w:jc w:val="start"/>
+        <w:rPr/>
+      </w:pPr>
+      <w:r>
+        <w:rPr/>
+        <w:t>A structural validator can show that the scenarios contain required fields and that references resolve. It cannot establish that a model actually chose the right modules or stopped before a dangerous action. Behavioral confidence requires running the cases in Codex and Claude with synthetic fixtures, observing tool calls and resulting diffs, and recording passes, failures, or cases not run. Comparisons should focus on decisions and effects rather than identical wording.</w:t>
+      </w:r>
+    </w:p>
+    <w:p>
+      <w:pPr>
+        <w:pStyle w:val="Heading3"/>
+        <w:bidi w:val="0"/>
+        <w:jc w:val="start"/>
+        <w:rPr/>
+      </w:pPr>
+      <w:r>
+        <w:rPr/>
+        <w:t>Maintaining the context budget</w:t>
+      </w:r>
+    </w:p>
+    <w:p>
+      <w:pPr>
+        <w:pStyle w:val="BodyText"/>
+        <w:bidi w:val="0"/>
+        <w:jc w:val="start"/>
+        <w:rPr/>
+      </w:pPr>
+      <w:r>
+        <w:rPr/>
+        <w:t>The baseline must remain short enough to load at session start while retaining precedence, risk, user override, project priority, and core safety. Task modules should contain detail that only some work needs. Repetition is justified when a standalone skill needs its own safety boundary; repeated explanatory prose in every startup file is not. The source DOCX, maintenance reports, and evaluation suite are useful to maintainers but add no value to an ordinary coding session unless the developer asks about them.</w:t>
+      </w:r>
+    </w:p>
+    <w:p>
+      <w:pPr>
         <w:pStyle w:val="Heading2"/>
         <w:bidi w:val="0"/>
         <w:jc w:val="start"/>
@@ -956,7 +1498,7 @@
       <w:pPr>
         <w:pStyle w:val="BodyText"/>
         <w:bidi w:val="0"/>
-        <w:spacing w:before="0" w:after="120"/>
+        <w:spacing w:before="0" w:after="140"/>
         <w:jc w:val="start"/>
         <w:rPr/>
       </w:pPr>
@@ -972,7 +1514,7 @@
       <w:pgNumType w:fmt="decimal"/>
       <w:formProt w:val="false"/>
       <w:textDirection w:val="lrTb"/>
-      <w:docGrid w:type="default" w:linePitch="600" w:charSpace="38911"/>
+      <w:docGrid w:type="default" w:linePitch="600" w:charSpace="36864"/>
     </w:sectPr>
   </w:body>
 </w:document>
@@ -1252,13 +1794,13 @@
     <w:pPr>
       <w:widowControl w:val="false"/>
       <w:bidi w:val="0"/>
-      <w:spacing w:lineRule="auto" w:line="312"/>
+      <w:spacing w:lineRule="auto" w:line="322"/>
     </w:pPr>
     <w:rPr>
       <w:rFonts w:ascii="Aptos;Calibri;Arial;sans-serif" w:hAnsi="Aptos;Calibri;Arial;sans-serif" w:eastAsia="Aptos;Calibri;Arial;sans-serif" w:cs="Aptos;Calibri;Arial;sans-serif"/>
       <w:color w:val="171717"/>
-      <w:sz w:val="21"/>
-      <w:szCs w:val="21"/>
+      <w:sz w:val="22"/>
+      <w:szCs w:val="22"/>
       <w:lang w:val="en-ID" w:eastAsia="zh-CN" w:bidi="hi-IN"/>
     </w:rPr>
   </w:style>
@@ -1437,7 +1979,7 @@
     <w:name w:val="Body Text"/>
     <w:basedOn w:val="Normal"/>
     <w:pPr>
-      <w:spacing w:before="0" w:after="120"/>
+      <w:spacing w:before="0" w:after="140"/>
     </w:pPr>
     <w:rPr/>
   </w:style>
@@ -1483,6 +2025,10 @@
       <w:bCs/>
       <w:color w:val="000000"/>
     </w:rPr>
+  </w:style>
+  <w:style w:type="paragraph" w:styleId="Title">
+    <w:name w:val="Title"/>
+    <w:basedOn w:val="Heading1"/>
   </w:style>
 </w:styles>
 </file>

</xml_diff>

<commit_message>
docs(spec): align specification with DevBrain v2.1
</commit_message>
<xml_diff>
--- a/source/DevBrain_v2_Developer_Context_Specification.docx
+++ b/source/DevBrain_v2_Developer_Context_Specification.docx
@@ -24,7 +24,7 @@
       </w:pPr>
       <w:r>
         <w:rPr/>
-        <w:t>Version 2.0  |  Conceptual and operational design</w:t>
+        <w:t>Version 2.1  |  Conceptual and operational design</w:t>
       </w:r>
     </w:p>
     <w:p>
@@ -216,7 +216,7 @@
       </w:r>
       <w:r>
         <w:rPr/>
-        <w:t xml:space="preserve"> holds four focused packages whose references are read progressively. These areas are chosen by task rather than scanned at session start.</w:t>
+        <w:t xml:space="preserve"> holds seven focused packages whose references are read progressively. These areas are chosen by task rather than scanned at session start.</w:t>
       </w:r>
     </w:p>
     <w:p>
@@ -1169,7 +1169,7 @@
       </w:pPr>
       <w:r>
         <w:rPr/>
-        <w:t xml:space="preserve">The four custom skills have separate purposes: </w:t>
+        <w:t xml:space="preserve">The seven custom skills have separate purposes. </w:t>
       </w:r>
       <w:r>
         <w:rPr>
@@ -1179,7 +1179,7 @@
       </w:r>
       <w:r>
         <w:rPr/>
-        <w:t xml:space="preserve"> for operational interfaces; </w:t>
+        <w:t xml:space="preserve"> covers operational interfaces; </w:t>
       </w:r>
       <w:r>
         <w:rPr>
@@ -1189,7 +1189,7 @@
       </w:r>
       <w:r>
         <w:rPr/>
-        <w:t xml:space="preserve"> for narrative and conversion surfaces; </w:t>
+        <w:t xml:space="preserve"> covers narrative and conversion surfaces; </w:t>
       </w:r>
       <w:r>
         <w:rPr>
@@ -1199,7 +1199,7 @@
       </w:r>
       <w:r>
         <w:rPr/>
-        <w:t xml:space="preserve"> for tokens and shared UI contracts; and </w:t>
+        <w:t xml:space="preserve"> covers tokens and shared UI contracts; and </w:t>
       </w:r>
       <w:r>
         <w:rPr>
@@ -1209,7 +1209,37 @@
       </w:r>
       <w:r>
         <w:rPr/>
-        <w:t xml:space="preserve"> for responsibility, dependency, and data boundaries. The assistant chooses a primary skill by outcome, adds another only for a distinct subtask, and reads reference files only when a concrete decision needs them.</w:t>
+        <w:t xml:space="preserve"> covers responsibility, dependency, and data boundaries. </w:t>
+      </w:r>
+      <w:r>
+        <w:rPr>
+          <w:rStyle w:val="SourceText"/>
+        </w:rPr>
+        <w:t>frontend-performance</w:t>
+      </w:r>
+      <w:r>
+        <w:rPr/>
+        <w:t xml:space="preserve"> diagnoses and improves measured browser delays; </w:t>
+      </w:r>
+      <w:r>
+        <w:rPr>
+          <w:rStyle w:val="SourceText"/>
+        </w:rPr>
+        <w:t>accessibility-audit</w:t>
+      </w:r>
+      <w:r>
+        <w:rPr/>
+        <w:t xml:space="preserve"> reviews and fixes interface barriers; and </w:t>
+      </w:r>
+      <w:r>
+        <w:rPr>
+          <w:rStyle w:val="SourceText"/>
+        </w:rPr>
+        <w:t>testing-strategy</w:t>
+      </w:r>
+      <w:r>
+        <w:rPr/>
+        <w:t xml:space="preserve"> selects and implements meaningful tests. The assistant chooses a primary skill by outcome, adds another only for a distinct subtask, and reads reference files only when a concrete decision needs them.</w:t>
       </w:r>
     </w:p>
     <w:p>
@@ -1262,6 +1292,18 @@
     </w:p>
     <w:p>
       <w:pPr>
+        <w:pStyle w:val="BodyText"/>
+        <w:bidi w:val="0"/>
+        <w:jc w:val="start"/>
+        <w:rPr/>
+      </w:pPr>
+      <w:r>
+        <w:rPr/>
+        <w:t>The performance, accessibility, and testing skills each distinguish review from implementation. An audit-only request produces findings without edits. A request to optimize, fix accessibility, or add tests includes the relevant code changes and verification. Ordinary UI polish still considers accessibility and speed without automatically loading these three specialist skills; routine validation does not activate a testing strategy skill.</w:t>
+      </w:r>
+    </w:p>
+    <w:p>
+      <w:pPr>
         <w:pStyle w:val="Heading3"/>
         <w:bidi w:val="0"/>
         <w:jc w:val="start"/>
@@ -1305,7 +1347,7 @@
       </w:pPr>
       <w:r>
         <w:rPr/>
-        <w:t>Repository files use relative paths and placeholders rather than a developer's username, drive, or machine path. The PowerShell installer resolves the repository and user home at installation time, then writes a concrete path only into the local Codex or Claude loader. It installs a small managed bootstrap and four skills without administrator privileges, registry edits, a product CLI, or a background service.</w:t>
+        <w:t>Repository files use relative paths and placeholders rather than a developer's username, drive, or machine path. The PowerShell installer resolves the repository and user home at installation time, then writes a concrete path only into the local Codex or Claude loader. It installs a small managed bootstrap and seven skills without administrator privileges, registry edits, a product CLI, or a background service.</w:t>
       </w:r>
     </w:p>
     <w:p>
@@ -1361,7 +1403,19 @@
       </w:pPr>
       <w:r>
         <w:rPr/>
-        <w:t>On a new device, the developer clones the repository into any suitable folder and invokes the installer as a regular user. The installer locates its own repository root and the selected user profile, previews the planned changes when requested, and installs the Codex and Claude bootstrap plus the four custom skills. It injects a concrete local repository path only into the installed loader, because the host must know where to read the baseline. That device path does not flow back into version-controlled DevBrain files.</w:t>
+        <w:t>On a new device, the developer clones the repository into any suitable folder and invokes the installer as a regular user. The installer locates its own repository root and the selected user profile, previews the planned changes when requested, and installs the Codex and Claude bootstrap plus the seven custom skills. It injects a concrete local repository path only into the installed loader, because the host must know where to read the baseline. That device path does not flow back into version-controlled DevBrain files.</w:t>
+      </w:r>
+    </w:p>
+    <w:p>
+      <w:pPr>
+        <w:pStyle w:val="BodyText"/>
+        <w:bidi w:val="0"/>
+        <w:jc w:val="start"/>
+        <w:rPr/>
+      </w:pPr>
+      <w:r>
+        <w:rPr/>
+        <w:t>For an existing installation, the updater can preview the managed loader and skill changes before applying them. It replaces only managed DevBrain skill directories, preserves earlier copies in backups, and leaves other instructions outside the managed loader block intact. A new Codex or Claude session then discovers the updated skill list; copying files alone does not prove that a host chose the correct skill for a real task.</w:t>
       </w:r>
     </w:p>
     <w:p>
@@ -1407,7 +1461,7 @@
       </w:pPr>
       <w:r>
         <w:rPr/>
-        <w:t>The evaluation suite contains 24 behavioral scenarios covering UI improvement, redesign, marketing, refactoring, API contracts, authentication, data mutation, migration, Git listings, conflicting prompts, ambiguity, and skill selection. Each scenario records the expected context, autonomy, approval, touched files, validation, and forbidden behavior. Structural checks validate YAML, references, scripts, paths, and suite shape; they do not prove that a model followed every scenario in a live session.</w:t>
+        <w:t>The evaluation suite contains 30 behavioral scenarios covering UI improvement, redesign, marketing, refactoring, API contracts, authentication, data mutation, migration, Git listings, conflicting prompts, ambiguity, skill selection, and audit versus implementation behavior for the three new skills. Each scenario records the expected context, autonomy, approval, touched files, validation, and forbidden behavior. Structural checks validate YAML, references, scripts, paths, and suite shape; they do not prove that a model followed every scenario in a live session.</w:t>
       </w:r>
     </w:p>
     <w:p>

</xml_diff>

<commit_message>
docs(spec): align developer context specification with v2.2
</commit_message>
<xml_diff>
--- a/source/DevBrain_v2_Developer_Context_Specification.docx
+++ b/source/DevBrain_v2_Developer_Context_Specification.docx
@@ -24,7 +24,7 @@
       </w:pPr>
       <w:r>
         <w:rPr/>
-        <w:t>Version 2.1  |  Conceptual and operational design</w:t>
+        <w:t>Version 2.2  |  Conceptual and operational design</w:t>
       </w:r>
     </w:p>
     <w:p>
@@ -1328,6 +1328,114 @@
     </w:p>
     <w:p>
       <w:pPr>
+        <w:pStyle w:val="Heading3"/>
+        <w:bidi w:val="0"/>
+        <w:jc w:val="start"/>
+        <w:rPr/>
+      </w:pPr>
+      <w:r>
+        <w:rPr/>
+        <w:t>Project discovery</w:t>
+      </w:r>
+    </w:p>
+    <w:p>
+      <w:pPr>
+        <w:pStyle w:val="BodyText"/>
+        <w:bidi w:val="0"/>
+        <w:jc w:val="start"/>
+        <w:rPr/>
+      </w:pPr>
+      <w:r>
+        <w:rPr/>
+        <w:t>Discovery follows the requested task through an unfamiliar repository. The assistant reads applicable instructions, checks working-tree state, traces the affected entry point and consumers, finds existing conventions, and identifies safe validation commands. It separates implementation evidence from unknowns and stops expanding once the task boundaries are sufficiently understood. A small, known change needs no broad audit.</w:t>
+      </w:r>
+    </w:p>
+    <w:p>
+      <w:pPr>
+        <w:pStyle w:val="BodyText"/>
+        <w:bidi w:val="0"/>
+        <w:jc w:val="start"/>
+        <w:rPr/>
+      </w:pPr>
+      <w:r>
+        <w:rPr/>
+        <w:t>A standalone project scan stays read-only and reports findings. Discovery inside an authorized implementation task leads into that work without a new approval gate. Tests, setup scripts and servers may write artifacts or contact services; their definitions must be inspected before they are treated as read-only diagnostics. No project map or instruction file is persisted automatically.</w:t>
+      </w:r>
+    </w:p>
+    <w:p>
+      <w:pPr>
+        <w:pStyle w:val="Heading3"/>
+        <w:bidi w:val="0"/>
+        <w:jc w:val="start"/>
+        <w:rPr/>
+      </w:pPr>
+      <w:r>
+        <w:rPr/>
+        <w:t>Evidence based debugging</w:t>
+      </w:r>
+    </w:p>
+    <w:p>
+      <w:pPr>
+        <w:pStyle w:val="BodyText"/>
+        <w:bidi w:val="0"/>
+        <w:jc w:val="start"/>
+        <w:rPr/>
+      </w:pPr>
+      <w:r>
+        <w:rPr/>
+        <w:t>Debugging begins with expected versus observed behavior and a safe reproduction or other useful evidence. The assistant traces the relevant boundary, forms a small set of hypotheses, and chooses an observation that distinguishes them. It corrects the supported cause, preserves unrelated contracts, and checks the original symptom and nearby behavior. A diagnosis-only request remains read-only; a fix request includes correction when evidence and authorization permit it.</w:t>
+      </w:r>
+    </w:p>
+    <w:p>
+      <w:pPr>
+        <w:pStyle w:val="BodyText"/>
+        <w:bidi w:val="0"/>
+        <w:jc w:val="start"/>
+        <w:rPr/>
+      </w:pPr>
+      <w:r>
+        <w:rPr/>
+        <w:t>A focused regression test is useful when it can detect recurrence. Existing tools and synthetic fixtures are preferred; testing-strategy is loaded only for substantial test work. If reproduction or verification is unavailable, the report identifies the evidence and uncertainty instead of claiming a confirmed cause or verified resolution. Fixing a bug does not bypass an unapproved auth, permission, data or other high-risk boundary.</w:t>
+      </w:r>
+    </w:p>
+    <w:p>
+      <w:pPr>
+        <w:pStyle w:val="Heading3"/>
+        <w:bidi w:val="0"/>
+        <w:jc w:val="start"/>
+        <w:rPr/>
+      </w:pPr>
+      <w:r>
+        <w:rPr/>
+        <w:t>Adaptive definition of done</w:t>
+      </w:r>
+    </w:p>
+    <w:p>
+      <w:pPr>
+        <w:pStyle w:val="BodyText"/>
+        <w:bidi w:val="0"/>
+        <w:jc w:val="start"/>
+        <w:rPr/>
+      </w:pPr>
+      <w:r>
+        <w:rPr/>
+        <w:t>Completion criteria follow the requested outcome and project acceptance rules. UI work needs relevant states, project visual fit and interaction evidence; API work needs affected contracts and negative cases; a refactor needs behavior and consumer checks; an optimization needs comparable measurement. Select relevant evidence rather than applying every domain checklist to every task.</w:t>
+      </w:r>
+    </w:p>
+    <w:p>
+      <w:pPr>
+        <w:pStyle w:val="BodyText"/>
+        <w:bidi w:val="0"/>
+        <w:jc w:val="start"/>
+        <w:rPr/>
+      </w:pPr>
+      <w:r>
+        <w:rPr/>
+        <w:t>The assistant distinguishes implemented and verified, implemented but unverified, partially implemented, and blocked. A read-only done-check reports gaps without silently fixing them. An implementation task may address relevant authorized gaps and stops expanding once the outcome and material criteria are satisfied. The three v2.2 workflows are selective repository modules; the baseline and seven standalone skills retain their roles.</w:t>
+      </w:r>
+    </w:p>
+    <w:p>
+      <w:pPr>
         <w:pStyle w:val="Heading2"/>
         <w:bidi w:val="0"/>
         <w:jc w:val="start"/>
@@ -1442,6 +1550,18 @@
     </w:p>
     <w:p>
       <w:pPr>
+        <w:pStyle w:val="BodyText"/>
+        <w:bidi w:val="0"/>
+        <w:jc w:val="start"/>
+        <w:rPr/>
+      </w:pPr>
+      <w:r>
+        <w:rPr/>
+        <w:t>V2.2 adds workflows in the repository without changing the installed loader or seven skill payloads. Existing loaders select them from the updated task map. A new session or explicit DevBrain reload refreshes active context after the checkout changes; a moved checkout still needs its loader path updated through the installer.</w:t>
+      </w:r>
+    </w:p>
+    <w:p>
+      <w:pPr>
         <w:pStyle w:val="Heading2"/>
         <w:bidi w:val="0"/>
         <w:jc w:val="start"/>
@@ -1461,7 +1581,7 @@
       </w:pPr>
       <w:r>
         <w:rPr/>
-        <w:t>The evaluation suite contains 30 behavioral scenarios covering UI improvement, redesign, marketing, refactoring, API contracts, authentication, data mutation, migration, Git listings, conflicting prompts, ambiguity, skill selection, and audit versus implementation behavior for the three new skills. Each scenario records the expected context, autonomy, approval, touched files, validation, and forbidden behavior. Structural checks validate YAML, references, scripts, paths, and suite shape; they do not prove that a model followed every scenario in a live session.</w:t>
+        <w:t>The evaluation suite contains 38 behavioral scenarios covering UI improvement, redesign, marketing, refactoring, API contracts, authentication, data mutation, migration, Git listings, conflicting prompts, ambiguity, skill selection, and audit versus implementation behavior. Eight v2.2 cases cover scoped discovery, small-task restraint, discovery followed by implementation, diagnosis and correction, unavailable reproduction, protected security changes, and read-only completion review. Each scenario specifies context, autonomy, approval, touched files, validation, and forbidden behavior. Structural checks do not establish live model compliance.</w:t>
       </w:r>
     </w:p>
     <w:p>
@@ -1558,7 +1678,7 @@
       </w:pPr>
       <w:r>
         <w:rPr/>
-        <w:t>This document explains the design and quality standard of DevBrain v2 for review and discussion. It is deliberately general and contains no private biography, client project facts, credentials, or device-specific paths. The assistant's active rules come from the maintained runtime, project context, applicable platform instructions, and the latest user request.</w:t>
+        <w:t>This document explains the design and quality standard of DevBrain v2.2 for review and discussion. It is deliberately general and contains no private biography, client project facts, credentials, or device-specific paths. The assistant's active rules come from the maintained runtime, project context, applicable platform instructions, and the latest user request.</w:t>
       </w:r>
     </w:p>
     <w:sectPr>

</xml_diff>